<commit_message>
Fix valuation models, clean notebook, tidy docs
</commit_message>
<xml_diff>
--- a/research/BP DCF Analysis report.docx
+++ b/research/BP DCF Analysis report.docx
@@ -224,15 +224,7 @@
           <w:b/>
           <w:bCs/>
         </w:rPr>
-        <w:t>1.</w:t>
-      </w:r>
-      <w:r>
-        <w:rPr>
-          <w:rFonts w:ascii="Times New Roman" w:hAnsi="Times New Roman" w:cs="Times New Roman"/>
-          <w:b/>
-          <w:bCs/>
-        </w:rPr>
-        <w:t xml:space="preserve">  Key Assumptions</w:t>
+        <w:t xml:space="preserve">1.  Key Assumptions</w:t>
       </w:r>
     </w:p>
     <w:p>
@@ -1202,7 +1194,7 @@
                 <w:lang w:eastAsia="en-GB"/>
                 <w14:ligatures w14:val="none"/>
               </w:rPr>
-              <w:t>2,570</w:t>
+              <w:t>15,700</w:t>
             </w:r>
           </w:p>
         </w:tc>
@@ -1734,19 +1726,7 @@
                 <w:lang w:eastAsia="en-GB"/>
                 <w14:ligatures w14:val="none"/>
               </w:rPr>
-              <w:t>10,667</w:t>
-            </w:r>
-            <w:r>
-              <w:rPr>
-                <w:rFonts w:ascii="Aptos Narrow" w:eastAsia="Times New Roman" w:hAnsi="Aptos Narrow" w:cs="Times New Roman"/>
-                <w:color w:val="000000"/>
-                <w:kern w:val="0"/>
-                <w:sz w:val="22"/>
-                <w:szCs w:val="22"/>
-                <w:lang w:eastAsia="en-GB"/>
-                <w14:ligatures w14:val="none"/>
-              </w:rPr>
-              <w:t>.00</w:t>
+              <w:t>10,667.00</w:t>
             </w:r>
           </w:p>
         </w:tc>
@@ -1862,31 +1842,7 @@
                 <w:lang w:eastAsia="en-GB"/>
                 <w14:ligatures w14:val="none"/>
               </w:rPr>
-              <w:t>10</w:t>
-            </w:r>
-            <w:r>
-              <w:rPr>
-                <w:rFonts w:ascii="Aptos Narrow" w:eastAsia="Times New Roman" w:hAnsi="Aptos Narrow" w:cs="Times New Roman"/>
-                <w:color w:val="000000"/>
-                <w:kern w:val="0"/>
-                <w:sz w:val="22"/>
-                <w:szCs w:val="22"/>
-                <w:lang w:eastAsia="en-GB"/>
-                <w14:ligatures w14:val="none"/>
-              </w:rPr>
-              <w:t>,</w:t>
-            </w:r>
-            <w:r>
-              <w:rPr>
-                <w:rFonts w:ascii="Aptos Narrow" w:eastAsia="Times New Roman" w:hAnsi="Aptos Narrow" w:cs="Times New Roman"/>
-                <w:color w:val="000000"/>
-                <w:kern w:val="0"/>
-                <w:sz w:val="22"/>
-                <w:szCs w:val="22"/>
-                <w:lang w:eastAsia="en-GB"/>
-                <w14:ligatures w14:val="none"/>
-              </w:rPr>
-              <w:t>880.34</w:t>
+              <w:t>10,880.34</w:t>
             </w:r>
           </w:p>
         </w:tc>
@@ -2014,43 +1970,7 @@
                 <w:lang w:eastAsia="en-GB"/>
                 <w14:ligatures w14:val="none"/>
               </w:rPr>
-              <w:t>11</w:t>
-            </w:r>
-            <w:r>
-              <w:rPr>
-                <w:rFonts w:ascii="Aptos Narrow" w:eastAsia="Times New Roman" w:hAnsi="Aptos Narrow" w:cs="Times New Roman"/>
-                <w:color w:val="000000"/>
-                <w:kern w:val="0"/>
-                <w:sz w:val="22"/>
-                <w:szCs w:val="22"/>
-                <w:lang w:eastAsia="en-GB"/>
-                <w14:ligatures w14:val="none"/>
-              </w:rPr>
-              <w:t>,</w:t>
-            </w:r>
-            <w:r>
-              <w:rPr>
-                <w:rFonts w:ascii="Aptos Narrow" w:eastAsia="Times New Roman" w:hAnsi="Aptos Narrow" w:cs="Times New Roman"/>
-                <w:color w:val="000000"/>
-                <w:kern w:val="0"/>
-                <w:sz w:val="22"/>
-                <w:szCs w:val="22"/>
-                <w:lang w:eastAsia="en-GB"/>
-                <w14:ligatures w14:val="none"/>
-              </w:rPr>
-              <w:t>097.9</w:t>
-            </w:r>
-            <w:r>
-              <w:rPr>
-                <w:rFonts w:ascii="Aptos Narrow" w:eastAsia="Times New Roman" w:hAnsi="Aptos Narrow" w:cs="Times New Roman"/>
-                <w:color w:val="000000"/>
-                <w:kern w:val="0"/>
-                <w:sz w:val="22"/>
-                <w:szCs w:val="22"/>
-                <w:lang w:eastAsia="en-GB"/>
-                <w14:ligatures w14:val="none"/>
-              </w:rPr>
-              <w:t>5</w:t>
+              <w:t>11,097.95</w:t>
             </w:r>
           </w:p>
         </w:tc>
@@ -2178,43 +2098,7 @@
                 <w:lang w:eastAsia="en-GB"/>
                 <w14:ligatures w14:val="none"/>
               </w:rPr>
-              <w:t>11</w:t>
-            </w:r>
-            <w:r>
-              <w:rPr>
-                <w:rFonts w:ascii="Aptos Narrow" w:eastAsia="Times New Roman" w:hAnsi="Aptos Narrow" w:cs="Times New Roman"/>
-                <w:color w:val="000000"/>
-                <w:kern w:val="0"/>
-                <w:sz w:val="22"/>
-                <w:szCs w:val="22"/>
-                <w:lang w:eastAsia="en-GB"/>
-                <w14:ligatures w14:val="none"/>
-              </w:rPr>
-              <w:t>,</w:t>
-            </w:r>
-            <w:r>
-              <w:rPr>
-                <w:rFonts w:ascii="Aptos Narrow" w:eastAsia="Times New Roman" w:hAnsi="Aptos Narrow" w:cs="Times New Roman"/>
-                <w:color w:val="000000"/>
-                <w:kern w:val="0"/>
-                <w:sz w:val="22"/>
-                <w:szCs w:val="22"/>
-                <w:lang w:eastAsia="en-GB"/>
-                <w14:ligatures w14:val="none"/>
-              </w:rPr>
-              <w:t>319.9</w:t>
-            </w:r>
-            <w:r>
-              <w:rPr>
-                <w:rFonts w:ascii="Aptos Narrow" w:eastAsia="Times New Roman" w:hAnsi="Aptos Narrow" w:cs="Times New Roman"/>
-                <w:color w:val="000000"/>
-                <w:kern w:val="0"/>
-                <w:sz w:val="22"/>
-                <w:szCs w:val="22"/>
-                <w:lang w:eastAsia="en-GB"/>
-                <w14:ligatures w14:val="none"/>
-              </w:rPr>
-              <w:t>1</w:t>
+              <w:t>11,319.91</w:t>
             </w:r>
           </w:p>
         </w:tc>
@@ -2342,31 +2226,7 @@
                 <w:lang w:eastAsia="en-GB"/>
                 <w14:ligatures w14:val="none"/>
               </w:rPr>
-              <w:t>11</w:t>
-            </w:r>
-            <w:r>
-              <w:rPr>
-                <w:rFonts w:ascii="Aptos Narrow" w:eastAsia="Times New Roman" w:hAnsi="Aptos Narrow" w:cs="Times New Roman"/>
-                <w:color w:val="000000"/>
-                <w:kern w:val="0"/>
-                <w:sz w:val="22"/>
-                <w:szCs w:val="22"/>
-                <w:lang w:eastAsia="en-GB"/>
-                <w14:ligatures w14:val="none"/>
-              </w:rPr>
-              <w:t>,</w:t>
-            </w:r>
-            <w:r>
-              <w:rPr>
-                <w:rFonts w:ascii="Aptos Narrow" w:eastAsia="Times New Roman" w:hAnsi="Aptos Narrow" w:cs="Times New Roman"/>
-                <w:color w:val="000000"/>
-                <w:kern w:val="0"/>
-                <w:sz w:val="22"/>
-                <w:szCs w:val="22"/>
-                <w:lang w:eastAsia="en-GB"/>
-                <w14:ligatures w14:val="none"/>
-              </w:rPr>
-              <w:t>546.30</w:t>
+              <w:t>11,546.30</w:t>
             </w:r>
           </w:p>
         </w:tc>
@@ -2494,43 +2354,7 @@
                 <w:lang w:eastAsia="en-GB"/>
                 <w14:ligatures w14:val="none"/>
               </w:rPr>
-              <w:t>11</w:t>
-            </w:r>
-            <w:r>
-              <w:rPr>
-                <w:rFonts w:ascii="Aptos Narrow" w:eastAsia="Times New Roman" w:hAnsi="Aptos Narrow" w:cs="Times New Roman"/>
-                <w:color w:val="000000"/>
-                <w:kern w:val="0"/>
-                <w:sz w:val="22"/>
-                <w:szCs w:val="22"/>
-                <w:lang w:eastAsia="en-GB"/>
-                <w14:ligatures w14:val="none"/>
-              </w:rPr>
-              <w:t>,</w:t>
-            </w:r>
-            <w:r>
-              <w:rPr>
-                <w:rFonts w:ascii="Aptos Narrow" w:eastAsia="Times New Roman" w:hAnsi="Aptos Narrow" w:cs="Times New Roman"/>
-                <w:color w:val="000000"/>
-                <w:kern w:val="0"/>
-                <w:sz w:val="22"/>
-                <w:szCs w:val="22"/>
-                <w:lang w:eastAsia="en-GB"/>
-                <w14:ligatures w14:val="none"/>
-              </w:rPr>
-              <w:t>777.2</w:t>
-            </w:r>
-            <w:r>
-              <w:rPr>
-                <w:rFonts w:ascii="Aptos Narrow" w:eastAsia="Times New Roman" w:hAnsi="Aptos Narrow" w:cs="Times New Roman"/>
-                <w:color w:val="000000"/>
-                <w:kern w:val="0"/>
-                <w:sz w:val="22"/>
-                <w:szCs w:val="22"/>
-                <w:lang w:eastAsia="en-GB"/>
-                <w14:ligatures w14:val="none"/>
-              </w:rPr>
-              <w:t>3</w:t>
+              <w:t>11,777.23</w:t>
             </w:r>
           </w:p>
         </w:tc>
@@ -3310,79 +3134,7 @@
                 <w:lang w:eastAsia="en-GB"/>
                 <w14:ligatures w14:val="none"/>
               </w:rPr>
-              <w:t>P</w:t>
-            </w:r>
-            <w:r>
-              <w:rPr>
-                <w:rFonts w:ascii="Aptos Narrow" w:eastAsia="Times New Roman" w:hAnsi="Aptos Narrow" w:cs="Times New Roman"/>
-                <w:b/>
-                <w:bCs/>
-                <w:color w:val="000000"/>
-                <w:kern w:val="0"/>
-                <w:lang w:eastAsia="en-GB"/>
-                <w14:ligatures w14:val="none"/>
-              </w:rPr>
-              <w:t xml:space="preserve">resent </w:t>
-            </w:r>
-            <w:r>
-              <w:rPr>
-                <w:rFonts w:ascii="Aptos Narrow" w:eastAsia="Times New Roman" w:hAnsi="Aptos Narrow" w:cs="Times New Roman"/>
-                <w:b/>
-                <w:bCs/>
-                <w:color w:val="000000"/>
-                <w:kern w:val="0"/>
-                <w:lang w:eastAsia="en-GB"/>
-                <w14:ligatures w14:val="none"/>
-              </w:rPr>
-              <w:t>V</w:t>
-            </w:r>
-            <w:r>
-              <w:rPr>
-                <w:rFonts w:ascii="Aptos Narrow" w:eastAsia="Times New Roman" w:hAnsi="Aptos Narrow" w:cs="Times New Roman"/>
-                <w:b/>
-                <w:bCs/>
-                <w:color w:val="000000"/>
-                <w:kern w:val="0"/>
-                <w:lang w:eastAsia="en-GB"/>
-                <w14:ligatures w14:val="none"/>
-              </w:rPr>
-              <w:t>alue</w:t>
-            </w:r>
-            <w:r>
-              <w:rPr>
-                <w:rFonts w:ascii="Aptos Narrow" w:eastAsia="Times New Roman" w:hAnsi="Aptos Narrow" w:cs="Times New Roman"/>
-                <w:b/>
-                <w:bCs/>
-                <w:color w:val="000000"/>
-                <w:kern w:val="0"/>
-                <w:lang w:eastAsia="en-GB"/>
-                <w14:ligatures w14:val="none"/>
-              </w:rPr>
-              <w:t xml:space="preserve"> of Forecast</w:t>
-            </w:r>
-            <w:r>
-              <w:rPr>
-                <w:rFonts w:ascii="Aptos Narrow" w:eastAsia="Times New Roman" w:hAnsi="Aptos Narrow" w:cs="Times New Roman"/>
-                <w:b/>
-                <w:bCs/>
-                <w:color w:val="000000"/>
-                <w:kern w:val="0"/>
-                <w:lang w:eastAsia="en-GB"/>
-                <w14:ligatures w14:val="none"/>
-              </w:rPr>
-              <w:t xml:space="preserve"> </w:t>
-            </w:r>
-            <w:r>
-              <w:rPr>
-                <w:rFonts w:ascii="Aptos Narrow" w:eastAsia="Times New Roman" w:hAnsi="Aptos Narrow" w:cs="Times New Roman"/>
-                <w:b/>
-                <w:bCs/>
-                <w:color w:val="000000"/>
-                <w:kern w:val="0"/>
-                <w:lang w:eastAsia="en-GB"/>
-                <w14:ligatures w14:val="none"/>
-              </w:rPr>
-              <w:t>FCF</w:t>
+              <w:t xml:space="preserve">Present Value of Forecast FCF</w:t>
             </w:r>
           </w:p>
         </w:tc>
@@ -3732,31 +3484,7 @@
                 <w:lang w:eastAsia="en-GB"/>
                 <w14:ligatures w14:val="none"/>
               </w:rPr>
-              <w:t>10</w:t>
-            </w:r>
-            <w:r>
-              <w:rPr>
-                <w:rFonts w:ascii="Aptos Narrow" w:eastAsia="Times New Roman" w:hAnsi="Aptos Narrow" w:cs="Times New Roman"/>
-                <w:color w:val="000000"/>
-                <w:kern w:val="0"/>
-                <w:sz w:val="22"/>
-                <w:szCs w:val="22"/>
-                <w:lang w:eastAsia="en-GB"/>
-                <w14:ligatures w14:val="none"/>
-              </w:rPr>
-              <w:t>,</w:t>
-            </w:r>
-            <w:r>
-              <w:rPr>
-                <w:rFonts w:ascii="Aptos Narrow" w:eastAsia="Times New Roman" w:hAnsi="Aptos Narrow" w:cs="Times New Roman"/>
-                <w:color w:val="000000"/>
-                <w:kern w:val="0"/>
-                <w:sz w:val="22"/>
-                <w:szCs w:val="22"/>
-                <w:lang w:eastAsia="en-GB"/>
-                <w14:ligatures w14:val="none"/>
-              </w:rPr>
-              <w:t>880.34</w:t>
+              <w:t>10,880.34</w:t>
             </w:r>
           </w:p>
         </w:tc>
@@ -3838,43 +3566,7 @@
                 <w:lang w:eastAsia="en-GB"/>
                 <w14:ligatures w14:val="none"/>
               </w:rPr>
-              <w:t>10</w:t>
-            </w:r>
-            <w:r>
-              <w:rPr>
-                <w:rFonts w:ascii="Aptos Narrow" w:eastAsia="Times New Roman" w:hAnsi="Aptos Narrow" w:cs="Times New Roman"/>
-                <w:color w:val="000000"/>
-                <w:kern w:val="0"/>
-                <w:sz w:val="22"/>
-                <w:szCs w:val="22"/>
-                <w:lang w:eastAsia="en-GB"/>
-                <w14:ligatures w14:val="none"/>
-              </w:rPr>
-              <w:t>,</w:t>
-            </w:r>
-            <w:r>
-              <w:rPr>
-                <w:rFonts w:ascii="Aptos Narrow" w:eastAsia="Times New Roman" w:hAnsi="Aptos Narrow" w:cs="Times New Roman"/>
-                <w:color w:val="000000"/>
-                <w:kern w:val="0"/>
-                <w:sz w:val="22"/>
-                <w:szCs w:val="22"/>
-                <w:lang w:eastAsia="en-GB"/>
-                <w14:ligatures w14:val="none"/>
-              </w:rPr>
-              <w:t>074.3</w:t>
-            </w:r>
-            <w:r>
-              <w:rPr>
-                <w:rFonts w:ascii="Aptos Narrow" w:eastAsia="Times New Roman" w:hAnsi="Aptos Narrow" w:cs="Times New Roman"/>
-                <w:color w:val="000000"/>
-                <w:kern w:val="0"/>
-                <w:sz w:val="22"/>
-                <w:szCs w:val="22"/>
-                <w:lang w:eastAsia="en-GB"/>
-                <w14:ligatures w14:val="none"/>
-              </w:rPr>
-              <w:t>9</w:t>
+              <w:t>10,074.39</w:t>
             </w:r>
           </w:p>
         </w:tc>
@@ -3961,43 +3653,7 @@
                 <w:lang w:eastAsia="en-GB"/>
                 <w14:ligatures w14:val="none"/>
               </w:rPr>
-              <w:t>11</w:t>
-            </w:r>
-            <w:r>
-              <w:rPr>
-                <w:rFonts w:ascii="Aptos Narrow" w:eastAsia="Times New Roman" w:hAnsi="Aptos Narrow" w:cs="Times New Roman"/>
-                <w:color w:val="000000"/>
-                <w:kern w:val="0"/>
-                <w:sz w:val="22"/>
-                <w:szCs w:val="22"/>
-                <w:lang w:eastAsia="en-GB"/>
-                <w14:ligatures w14:val="none"/>
-              </w:rPr>
-              <w:t>,</w:t>
-            </w:r>
-            <w:r>
-              <w:rPr>
-                <w:rFonts w:ascii="Aptos Narrow" w:eastAsia="Times New Roman" w:hAnsi="Aptos Narrow" w:cs="Times New Roman"/>
-                <w:color w:val="000000"/>
-                <w:kern w:val="0"/>
-                <w:sz w:val="22"/>
-                <w:szCs w:val="22"/>
-                <w:lang w:eastAsia="en-GB"/>
-                <w14:ligatures w14:val="none"/>
-              </w:rPr>
-              <w:t>097.9</w:t>
-            </w:r>
-            <w:r>
-              <w:rPr>
-                <w:rFonts w:ascii="Aptos Narrow" w:eastAsia="Times New Roman" w:hAnsi="Aptos Narrow" w:cs="Times New Roman"/>
-                <w:color w:val="000000"/>
-                <w:kern w:val="0"/>
-                <w:sz w:val="22"/>
-                <w:szCs w:val="22"/>
-                <w:lang w:eastAsia="en-GB"/>
-                <w14:ligatures w14:val="none"/>
-              </w:rPr>
-              <w:t>5</w:t>
+              <w:t>11,097.95</w:t>
             </w:r>
           </w:p>
         </w:tc>
@@ -4079,31 +3735,7 @@
                 <w:lang w:eastAsia="en-GB"/>
                 <w14:ligatures w14:val="none"/>
               </w:rPr>
-              <w:t>9</w:t>
-            </w:r>
-            <w:r>
-              <w:rPr>
-                <w:rFonts w:ascii="Aptos Narrow" w:eastAsia="Times New Roman" w:hAnsi="Aptos Narrow" w:cs="Times New Roman"/>
-                <w:color w:val="000000"/>
-                <w:kern w:val="0"/>
-                <w:sz w:val="22"/>
-                <w:szCs w:val="22"/>
-                <w:lang w:eastAsia="en-GB"/>
-                <w14:ligatures w14:val="none"/>
-              </w:rPr>
-              <w:t>,</w:t>
-            </w:r>
-            <w:r>
-              <w:rPr>
-                <w:rFonts w:ascii="Aptos Narrow" w:eastAsia="Times New Roman" w:hAnsi="Aptos Narrow" w:cs="Times New Roman"/>
-                <w:color w:val="000000"/>
-                <w:kern w:val="0"/>
-                <w:sz w:val="22"/>
-                <w:szCs w:val="22"/>
-                <w:lang w:eastAsia="en-GB"/>
-                <w14:ligatures w14:val="none"/>
-              </w:rPr>
-              <w:t>514.70</w:t>
+              <w:t>9,514.70</w:t>
             </w:r>
           </w:p>
         </w:tc>
@@ -4190,43 +3822,7 @@
                 <w:lang w:eastAsia="en-GB"/>
                 <w14:ligatures w14:val="none"/>
               </w:rPr>
-              <w:t>11</w:t>
-            </w:r>
-            <w:r>
-              <w:rPr>
-                <w:rFonts w:ascii="Aptos Narrow" w:eastAsia="Times New Roman" w:hAnsi="Aptos Narrow" w:cs="Times New Roman"/>
-                <w:color w:val="000000"/>
-                <w:kern w:val="0"/>
-                <w:sz w:val="22"/>
-                <w:szCs w:val="22"/>
-                <w:lang w:eastAsia="en-GB"/>
-                <w14:ligatures w14:val="none"/>
-              </w:rPr>
-              <w:t>,</w:t>
-            </w:r>
-            <w:r>
-              <w:rPr>
-                <w:rFonts w:ascii="Aptos Narrow" w:eastAsia="Times New Roman" w:hAnsi="Aptos Narrow" w:cs="Times New Roman"/>
-                <w:color w:val="000000"/>
-                <w:kern w:val="0"/>
-                <w:sz w:val="22"/>
-                <w:szCs w:val="22"/>
-                <w:lang w:eastAsia="en-GB"/>
-                <w14:ligatures w14:val="none"/>
-              </w:rPr>
-              <w:t>319.9</w:t>
-            </w:r>
-            <w:r>
-              <w:rPr>
-                <w:rFonts w:ascii="Aptos Narrow" w:eastAsia="Times New Roman" w:hAnsi="Aptos Narrow" w:cs="Times New Roman"/>
-                <w:color w:val="000000"/>
-                <w:kern w:val="0"/>
-                <w:sz w:val="22"/>
-                <w:szCs w:val="22"/>
-                <w:lang w:eastAsia="en-GB"/>
-                <w14:ligatures w14:val="none"/>
-              </w:rPr>
-              <w:t>1</w:t>
+              <w:t>11,319.91</w:t>
             </w:r>
           </w:p>
         </w:tc>
@@ -4308,43 +3904,7 @@
                 <w:lang w:eastAsia="en-GB"/>
                 <w14:ligatures w14:val="none"/>
               </w:rPr>
-              <w:t>8</w:t>
-            </w:r>
-            <w:r>
-              <w:rPr>
-                <w:rFonts w:ascii="Aptos Narrow" w:eastAsia="Times New Roman" w:hAnsi="Aptos Narrow" w:cs="Times New Roman"/>
-                <w:color w:val="000000"/>
-                <w:kern w:val="0"/>
-                <w:sz w:val="22"/>
-                <w:szCs w:val="22"/>
-                <w:lang w:eastAsia="en-GB"/>
-                <w14:ligatures w14:val="none"/>
-              </w:rPr>
-              <w:t>,</w:t>
-            </w:r>
-            <w:r>
-              <w:rPr>
-                <w:rFonts w:ascii="Aptos Narrow" w:eastAsia="Times New Roman" w:hAnsi="Aptos Narrow" w:cs="Times New Roman"/>
-                <w:color w:val="000000"/>
-                <w:kern w:val="0"/>
-                <w:sz w:val="22"/>
-                <w:szCs w:val="22"/>
-                <w:lang w:eastAsia="en-GB"/>
-                <w14:ligatures w14:val="none"/>
-              </w:rPr>
-              <w:t>986.1</w:t>
-            </w:r>
-            <w:r>
-              <w:rPr>
-                <w:rFonts w:ascii="Aptos Narrow" w:eastAsia="Times New Roman" w:hAnsi="Aptos Narrow" w:cs="Times New Roman"/>
-                <w:color w:val="000000"/>
-                <w:kern w:val="0"/>
-                <w:sz w:val="22"/>
-                <w:szCs w:val="22"/>
-                <w:lang w:eastAsia="en-GB"/>
-                <w14:ligatures w14:val="none"/>
-              </w:rPr>
-              <w:t>1</w:t>
+              <w:t>8,986.11</w:t>
             </w:r>
           </w:p>
         </w:tc>
@@ -4431,31 +3991,7 @@
                 <w:lang w:eastAsia="en-GB"/>
                 <w14:ligatures w14:val="none"/>
               </w:rPr>
-              <w:t>11</w:t>
-            </w:r>
-            <w:r>
-              <w:rPr>
-                <w:rFonts w:ascii="Aptos Narrow" w:eastAsia="Times New Roman" w:hAnsi="Aptos Narrow" w:cs="Times New Roman"/>
-                <w:color w:val="000000"/>
-                <w:kern w:val="0"/>
-                <w:sz w:val="22"/>
-                <w:szCs w:val="22"/>
-                <w:lang w:eastAsia="en-GB"/>
-                <w14:ligatures w14:val="none"/>
-              </w:rPr>
-              <w:t>,</w:t>
-            </w:r>
-            <w:r>
-              <w:rPr>
-                <w:rFonts w:ascii="Aptos Narrow" w:eastAsia="Times New Roman" w:hAnsi="Aptos Narrow" w:cs="Times New Roman"/>
-                <w:color w:val="000000"/>
-                <w:kern w:val="0"/>
-                <w:sz w:val="22"/>
-                <w:szCs w:val="22"/>
-                <w:lang w:eastAsia="en-GB"/>
-                <w14:ligatures w14:val="none"/>
-              </w:rPr>
-              <w:t>546.30</w:t>
+              <w:t>11,546.30</w:t>
             </w:r>
           </w:p>
         </w:tc>
@@ -4537,43 +4073,7 @@
                 <w:lang w:eastAsia="en-GB"/>
                 <w14:ligatures w14:val="none"/>
               </w:rPr>
-              <w:t>8</w:t>
-            </w:r>
-            <w:r>
-              <w:rPr>
-                <w:rFonts w:ascii="Aptos Narrow" w:eastAsia="Times New Roman" w:hAnsi="Aptos Narrow" w:cs="Times New Roman"/>
-                <w:color w:val="000000"/>
-                <w:kern w:val="0"/>
-                <w:sz w:val="22"/>
-                <w:szCs w:val="22"/>
-                <w:lang w:eastAsia="en-GB"/>
-                <w14:ligatures w14:val="none"/>
-              </w:rPr>
-              <w:t>,</w:t>
-            </w:r>
-            <w:r>
-              <w:rPr>
-                <w:rFonts w:ascii="Aptos Narrow" w:eastAsia="Times New Roman" w:hAnsi="Aptos Narrow" w:cs="Times New Roman"/>
-                <w:color w:val="000000"/>
-                <w:kern w:val="0"/>
-                <w:sz w:val="22"/>
-                <w:szCs w:val="22"/>
-                <w:lang w:eastAsia="en-GB"/>
-                <w14:ligatures w14:val="none"/>
-              </w:rPr>
-              <w:t>486.8</w:t>
-            </w:r>
-            <w:r>
-              <w:rPr>
-                <w:rFonts w:ascii="Aptos Narrow" w:eastAsia="Times New Roman" w:hAnsi="Aptos Narrow" w:cs="Times New Roman"/>
-                <w:color w:val="000000"/>
-                <w:kern w:val="0"/>
-                <w:sz w:val="22"/>
-                <w:szCs w:val="22"/>
-                <w:lang w:eastAsia="en-GB"/>
-                <w14:ligatures w14:val="none"/>
-              </w:rPr>
-              <w:t>8</w:t>
+              <w:t>8,486.88</w:t>
             </w:r>
           </w:p>
         </w:tc>
@@ -4660,43 +4160,7 @@
                 <w:lang w:eastAsia="en-GB"/>
                 <w14:ligatures w14:val="none"/>
               </w:rPr>
-              <w:t>11</w:t>
-            </w:r>
-            <w:r>
-              <w:rPr>
-                <w:rFonts w:ascii="Aptos Narrow" w:eastAsia="Times New Roman" w:hAnsi="Aptos Narrow" w:cs="Times New Roman"/>
-                <w:color w:val="000000"/>
-                <w:kern w:val="0"/>
-                <w:sz w:val="22"/>
-                <w:szCs w:val="22"/>
-                <w:lang w:eastAsia="en-GB"/>
-                <w14:ligatures w14:val="none"/>
-              </w:rPr>
-              <w:t>,</w:t>
-            </w:r>
-            <w:r>
-              <w:rPr>
-                <w:rFonts w:ascii="Aptos Narrow" w:eastAsia="Times New Roman" w:hAnsi="Aptos Narrow" w:cs="Times New Roman"/>
-                <w:color w:val="000000"/>
-                <w:kern w:val="0"/>
-                <w:sz w:val="22"/>
-                <w:szCs w:val="22"/>
-                <w:lang w:eastAsia="en-GB"/>
-                <w14:ligatures w14:val="none"/>
-              </w:rPr>
-              <w:t>777.2</w:t>
-            </w:r>
-            <w:r>
-              <w:rPr>
-                <w:rFonts w:ascii="Aptos Narrow" w:eastAsia="Times New Roman" w:hAnsi="Aptos Narrow" w:cs="Times New Roman"/>
-                <w:color w:val="000000"/>
-                <w:kern w:val="0"/>
-                <w:sz w:val="22"/>
-                <w:szCs w:val="22"/>
-                <w:lang w:eastAsia="en-GB"/>
-                <w14:ligatures w14:val="none"/>
-              </w:rPr>
-              <w:t>3</w:t>
+              <w:t>11,777.23</w:t>
             </w:r>
           </w:p>
         </w:tc>
@@ -4778,31 +4242,7 @@
                 <w:lang w:eastAsia="en-GB"/>
                 <w14:ligatures w14:val="none"/>
               </w:rPr>
-              <w:t>8</w:t>
-            </w:r>
-            <w:r>
-              <w:rPr>
-                <w:rFonts w:ascii="Aptos Narrow" w:eastAsia="Times New Roman" w:hAnsi="Aptos Narrow" w:cs="Times New Roman"/>
-                <w:color w:val="000000"/>
-                <w:kern w:val="0"/>
-                <w:sz w:val="22"/>
-                <w:szCs w:val="22"/>
-                <w:lang w:eastAsia="en-GB"/>
-                <w14:ligatures w14:val="none"/>
-              </w:rPr>
-              <w:t>,</w:t>
-            </w:r>
-            <w:r>
-              <w:rPr>
-                <w:rFonts w:ascii="Aptos Narrow" w:eastAsia="Times New Roman" w:hAnsi="Aptos Narrow" w:cs="Times New Roman"/>
-                <w:color w:val="000000"/>
-                <w:kern w:val="0"/>
-                <w:sz w:val="22"/>
-                <w:szCs w:val="22"/>
-                <w:lang w:eastAsia="en-GB"/>
-                <w14:ligatures w14:val="none"/>
-              </w:rPr>
-              <w:t>015.38</w:t>
+              <w:t>8,015.38</w:t>
             </w:r>
           </w:p>
         </w:tc>
@@ -4857,15 +4297,7 @@
           <w:i/>
           <w:iCs/>
         </w:rPr>
-        <w:t xml:space="preserve">Each year’s cash flow is multiplied by its discount factor to obtain its present value. </w:t>
-      </w:r>
-      <w:r>
-        <w:rPr>
-          <w:rFonts w:ascii="Times New Roman" w:hAnsi="Times New Roman" w:cs="Times New Roman"/>
-          <w:i/>
-          <w:iCs/>
-        </w:rPr>
-        <w:t>The sum of all these gives the PV of all forecasted FCFs.</w:t>
+        <w:t xml:space="preserve">Each year’s cash flow is multiplied by its discount factor to obtain its present value. The sum of all these gives the PV of all forecasted FCFs.</w:t>
       </w:r>
     </w:p>
     <w:p>
@@ -5014,19 +4446,7 @@
                 <w:lang w:eastAsia="en-GB"/>
                 <w14:ligatures w14:val="none"/>
               </w:rPr>
-              <w:t>E</w:t>
-            </w:r>
-            <w:r>
-              <w:rPr>
-                <w:rFonts w:ascii="Aptos Narrow" w:eastAsia="Times New Roman" w:hAnsi="Aptos Narrow" w:cs="Times New Roman"/>
-                <w:b/>
-                <w:bCs/>
-                <w:color w:val="000000"/>
-                <w:kern w:val="0"/>
-                <w:lang w:eastAsia="en-GB"/>
-                <w14:ligatures w14:val="none"/>
-              </w:rPr>
-              <w:t>nterprise Value (EV) Calculation</w:t>
+              <w:t>Enterprise Value (EV) Calculation</w:t>
             </w:r>
           </w:p>
         </w:tc>
@@ -5233,7 +4653,7 @@
                 <w:lang w:eastAsia="en-GB"/>
                 <w14:ligatures w14:val="none"/>
               </w:rPr>
-              <w:t>£56,621.73</w:t>
+              <w:t>£45,077.46</w:t>
             </w:r>
           </w:p>
         </w:tc>
@@ -5409,7 +4829,7 @@
                 <w:lang w:eastAsia="en-GB"/>
                 <w14:ligatures w14:val="none"/>
               </w:rPr>
-              <w:t>£181,785.04</w:t>
+              <w:t>£170,240.78</w:t>
             </w:r>
           </w:p>
         </w:tc>
@@ -5752,7 +5172,7 @@
                 <w:lang w:eastAsia="en-GB"/>
                 <w14:ligatures w14:val="none"/>
               </w:rPr>
-              <w:t>181,785.04</w:t>
+              <w:t>170,240.78</w:t>
             </w:r>
           </w:p>
         </w:tc>
@@ -5838,7 +5258,7 @@
                 <w:lang w:eastAsia="en-GB"/>
                 <w14:ligatures w14:val="none"/>
               </w:rPr>
-              <w:t>39,770.00</w:t>
+              <w:t>25,187.00</w:t>
             </w:r>
           </w:p>
         </w:tc>
@@ -5928,7 +5348,7 @@
                 <w:lang w:eastAsia="en-GB"/>
                 <w14:ligatures w14:val="none"/>
               </w:rPr>
-              <w:t>142,015.04</w:t>
+              <w:t>145,053.78</w:t>
             </w:r>
           </w:p>
         </w:tc>
@@ -6391,7 +5811,7 @@
                 <w:lang w:eastAsia="en-GB"/>
                 <w14:ligatures w14:val="none"/>
               </w:rPr>
-              <w:t>2,570</w:t>
+              <w:t>15,700</w:t>
             </w:r>
           </w:p>
         </w:tc>
@@ -6481,7 +5901,7 @@
                 <w:lang w:eastAsia="en-GB"/>
                 <w14:ligatures w14:val="none"/>
               </w:rPr>
-              <w:t>£55.26</w:t>
+              <w:t>£9.24</w:t>
             </w:r>
           </w:p>
         </w:tc>
@@ -6513,7 +5933,7 @@
           <w:i/>
           <w:iCs/>
         </w:rPr>
-        <w:t xml:space="preserve">The Equity Value represents the portion of EV attributable to shareholders after debt is accounted for. Dividing this by the number of outstanding shares gives the implied stock price. In this case, the DCF model suggests a value of £55.26 per share, which can be compared to the current market price to assess where BP is over- or undervalued. </w:t>
+        <w:t xml:space="preserve">The Equity Value represents the portion of EV attributable to shareholders after debt is accounted for. Dividing this by the number of outstanding shares gives the implied stock price. In this case, the DCF model suggests a value of £9.24 per share, which can be compared to the current market price to assess where BP is over- or undervalued. </w:t>
       </w:r>
     </w:p>
     <w:p>
@@ -6595,13 +6015,7 @@
         <w:rPr>
           <w:rFonts w:ascii="Times New Roman" w:hAnsi="Times New Roman" w:cs="Times New Roman"/>
         </w:rPr>
-        <w:t xml:space="preserve">The implied share price of £55.26 provides a theoretical valuation based on BP’s projected cash flows and risk profile. The current market price is £35.38 which is below the implied share price, indicating that the stock may be undervalued. Key drivers consist of the FCF growth rate, WACC, and terminal growth assumptions – changes in these can impact the implied price. This exercise highlights BP’s potential cash-generating activity. </w:t>
-      </w:r>
-      <w:r>
-        <w:rPr>
-          <w:rFonts w:ascii="Times New Roman" w:hAnsi="Times New Roman" w:cs="Times New Roman"/>
-        </w:rPr>
-        <w:t>However, since I used some assumptive values the final implied share price I attained may not be entirely accurate – it’s just an approximation.</w:t>
+        <w:t xml:space="preserve">The implied share price of £9.24 provides a theoretical valuation based on BP’s projected cash flows and risk profile. The current market price is approximately £5.42 (542p, September 2026), which is below the implied share price, indicating that the stock may be undervalued by around 70% on these assumptions. Key drivers consist of the FCF growth rate, WACC, and terminal growth assumptions – changes in these can impact the implied price. Around 74% of the enterprise value comes from the terminal value, so the result is highly sensitive to these inputs: across WACC of 7–9% and terminal growth of 1–2%, the implied price ranges from roughly £7.35 to £12.26 per share. This exercise highlights BP’s potential cash-generating activity. However, since I used some assumptive values the final implied share price I attained may not be entirely accurate – it is an approximation. BP also reports in US dollars, so the currency of the cash flow inputs should be confirmed.</w:t>
       </w:r>
     </w:p>
     <w:p>

</xml_diff>